<commit_message>
Fix lab 2 report file
</commit_message>
<xml_diff>
--- a/Івахненко_ЛР2.docx
+++ b/Івахненко_ЛР2.docx
@@ -459,6 +459,7 @@
           <w:lang w:val="uk-UA"/>
         </w:rPr>
       </w:pPr>
+      <w:bookmarkStart w:id="0" w:name="_GoBack"/>
       <w:proofErr w:type="spellStart"/>
       <w:r>
         <w:rPr>
@@ -479,9 +480,62 @@
           <w:szCs w:val="28"/>
           <w:lang w:val="uk-UA"/>
         </w:rPr>
-        <w:t>в Волков О. В.</w:t>
+        <w:t xml:space="preserve">в </w:t>
+      </w:r>
+      <w:proofErr w:type="spellStart"/>
+      <w:r>
+        <w:rPr>
+          <w:rFonts w:cs="Times New Roman"/>
+          <w:bCs/>
+          <w:sz w:val="28"/>
+          <w:szCs w:val="28"/>
+          <w:lang w:val="uk-UA"/>
+        </w:rPr>
+        <w:t>Головакін</w:t>
+      </w:r>
+      <w:proofErr w:type="spellEnd"/>
+      <w:r>
+        <w:rPr>
+          <w:rFonts w:cs="Times New Roman"/>
+          <w:bCs/>
+          <w:sz w:val="28"/>
+          <w:szCs w:val="28"/>
+          <w:lang w:val="uk-UA"/>
+        </w:rPr>
+        <w:t xml:space="preserve"> М</w:t>
+      </w:r>
+      <w:r>
+        <w:rPr>
+          <w:rFonts w:cs="Times New Roman"/>
+          <w:bCs/>
+          <w:sz w:val="28"/>
+          <w:szCs w:val="28"/>
+          <w:lang w:val="uk-UA"/>
+        </w:rPr>
+        <w:t xml:space="preserve">. </w:t>
+      </w:r>
+      <w:r>
+        <w:rPr>
+          <w:rFonts w:cs="Times New Roman"/>
+          <w:bCs/>
+          <w:sz w:val="28"/>
+          <w:szCs w:val="28"/>
+          <w:lang w:val="uk-UA"/>
+        </w:rPr>
+        <w:t>А</w:t>
+      </w:r>
+      <w:r>
+        <w:rPr>
+          <w:rFonts w:cs="Times New Roman"/>
+          <w:bCs/>
+          <w:sz w:val="28"/>
+          <w:szCs w:val="28"/>
+          <w:lang w:val="uk-UA"/>
+        </w:rPr>
+        <w:t>.</w:t>
       </w:r>
     </w:p>
+    <w:bookmarkEnd w:id="0"/>
     <w:p>
       <w:pPr>
         <w:spacing w:before="240" w:line="240" w:lineRule="auto"/>
@@ -500,6 +554,34 @@
       <w:pPr>
         <w:spacing w:before="240" w:line="240" w:lineRule="auto"/>
         <w:jc w:val="center"/>
+        <w:rPr>
+          <w:rFonts w:cs="Times New Roman"/>
+          <w:b/>
+          <w:bCs/>
+          <w:sz w:val="28"/>
+          <w:szCs w:val="28"/>
+          <w:lang w:val="uk-UA"/>
+        </w:rPr>
+      </w:pPr>
+    </w:p>
+    <w:p>
+      <w:pPr>
+        <w:spacing w:before="240" w:line="240" w:lineRule="auto"/>
+        <w:jc w:val="both"/>
+        <w:rPr>
+          <w:rFonts w:cs="Times New Roman"/>
+          <w:b/>
+          <w:bCs/>
+          <w:sz w:val="28"/>
+          <w:szCs w:val="28"/>
+          <w:lang w:val="uk-UA"/>
+        </w:rPr>
+      </w:pPr>
+    </w:p>
+    <w:p>
+      <w:pPr>
+        <w:spacing w:before="240" w:line="240" w:lineRule="auto"/>
+        <w:jc w:val="both"/>
         <w:rPr>
           <w:rFonts w:cs="Times New Roman"/>
           <w:b/>
@@ -7371,8 +7453,6 @@
           <w:lang w:val="uk-UA"/>
         </w:rPr>
       </w:pPr>
-      <w:bookmarkStart w:id="0" w:name="_GoBack"/>
-      <w:bookmarkEnd w:id="0"/>
     </w:p>
     <w:sectPr>
       <w:pgSz w:w="12240" w:h="15840"/>
@@ -19293,7 +19373,7 @@
 </file>
 
 <file path=customXml/itemProps1.xml><?xml version="1.0" encoding="utf-8"?>
-<ds:datastoreItem xmlns:ds="http://schemas.openxmlformats.org/officeDocument/2006/customXml" ds:itemID="{797C3A9F-009C-460F-A537-61321398AD72}">
+<ds:datastoreItem xmlns:ds="http://schemas.openxmlformats.org/officeDocument/2006/customXml" ds:itemID="{F782341A-E42E-493F-8D7E-7E8135C56F39}">
   <ds:schemaRefs>
     <ds:schemaRef ds:uri="http://schemas.openxmlformats.org/officeDocument/2006/bibliography"/>
   </ds:schemaRefs>

</xml_diff>